<commit_message>
ajustes de seguridad en la app
</commit_message>
<xml_diff>
--- a/backend/templates/FORMATO DESCUENTO DE ESTAMPILLAS.docx
+++ b/backend/templates/FORMATO DESCUENTO DE ESTAMPILLAS.docx
@@ -17,7 +17,23 @@
           <w:rFonts w:ascii="Arial" w:hAnsi="Arial"/>
           <w:sz w:val="24"/>
         </w:rPr>
-        <w:t>{{ciudad_fecha_estampillas}}</w:t>
+        <w:t>{{</w:t>
+      </w:r>
+      <w:proofErr w:type="spellStart"/>
+      <w:r>
+        <w:rPr>
+          <w:rFonts w:ascii="Arial" w:hAnsi="Arial"/>
+          <w:sz w:val="24"/>
+        </w:rPr>
+        <w:t>ciudad_fecha_estampillas</w:t>
+      </w:r>
+      <w:proofErr w:type="spellEnd"/>
+      <w:r>
+        <w:rPr>
+          <w:rFonts w:ascii="Arial" w:hAnsi="Arial"/>
+          <w:sz w:val="24"/>
+        </w:rPr>
+        <w:t>}}</w:t>
       </w:r>
     </w:p>
     <w:p>
@@ -176,7 +192,23 @@
           <w:rFonts w:ascii="Arial" w:hAnsi="Arial"/>
           <w:sz w:val="24"/>
         </w:rPr>
-        <w:t>Nombre y Apellido: {{nombre_contratista}}</w:t>
+        <w:t>Nombre y Apellido: {{</w:t>
+      </w:r>
+      <w:proofErr w:type="spellStart"/>
+      <w:r>
+        <w:rPr>
+          <w:rFonts w:ascii="Arial" w:hAnsi="Arial"/>
+          <w:sz w:val="24"/>
+        </w:rPr>
+        <w:t>nombre_contratista</w:t>
+      </w:r>
+      <w:proofErr w:type="spellEnd"/>
+      <w:r>
+        <w:rPr>
+          <w:rFonts w:ascii="Arial" w:hAnsi="Arial"/>
+          <w:sz w:val="24"/>
+        </w:rPr>
+        <w:t>}}</w:t>
       </w:r>
     </w:p>
     <w:p>
@@ -195,7 +227,23 @@
           <w:rFonts w:ascii="Arial" w:hAnsi="Arial"/>
           <w:sz w:val="24"/>
         </w:rPr>
-        <w:t>Cédula: {{cedula_expedicion_larga}}</w:t>
+        <w:t>Cédula: {{</w:t>
+      </w:r>
+      <w:proofErr w:type="spellStart"/>
+      <w:r>
+        <w:rPr>
+          <w:rFonts w:ascii="Arial" w:hAnsi="Arial"/>
+          <w:sz w:val="24"/>
+        </w:rPr>
+        <w:t>cedula_expedicion_larga</w:t>
+      </w:r>
+      <w:proofErr w:type="spellEnd"/>
+      <w:r>
+        <w:rPr>
+          <w:rFonts w:ascii="Arial" w:hAnsi="Arial"/>
+          <w:sz w:val="24"/>
+        </w:rPr>
+        <w:t>}}</w:t>
       </w:r>
     </w:p>
     <w:p>
@@ -214,7 +262,39 @@
           <w:rFonts w:ascii="Arial" w:hAnsi="Arial"/>
           <w:sz w:val="24"/>
         </w:rPr>
-        <w:t>Dirección: {{direccion_contratista}} Teléfono: {{telefono_contratista}}</w:t>
+        <w:t>Dirección: {{</w:t>
+      </w:r>
+      <w:proofErr w:type="spellStart"/>
+      <w:r>
+        <w:rPr>
+          <w:rFonts w:ascii="Arial" w:hAnsi="Arial"/>
+          <w:sz w:val="24"/>
+        </w:rPr>
+        <w:t>direccion_contratista</w:t>
+      </w:r>
+      <w:proofErr w:type="spellEnd"/>
+      <w:r>
+        <w:rPr>
+          <w:rFonts w:ascii="Arial" w:hAnsi="Arial"/>
+          <w:sz w:val="24"/>
+        </w:rPr>
+        <w:t>}} Teléfono: {{</w:t>
+      </w:r>
+      <w:proofErr w:type="spellStart"/>
+      <w:r>
+        <w:rPr>
+          <w:rFonts w:ascii="Arial" w:hAnsi="Arial"/>
+          <w:sz w:val="24"/>
+        </w:rPr>
+        <w:t>telefono_contratista</w:t>
+      </w:r>
+      <w:proofErr w:type="spellEnd"/>
+      <w:r>
+        <w:rPr>
+          <w:rFonts w:ascii="Arial" w:hAnsi="Arial"/>
+          <w:sz w:val="24"/>
+        </w:rPr>
+        <w:t>}}</w:t>
       </w:r>
     </w:p>
     <w:p>
@@ -263,30 +343,6 @@
           <w:szCs w:val="24"/>
         </w:rPr>
       </w:pPr>
-      <w:r>
-        <w:rPr>
-          <w:noProof/>
-        </w:rPr>
-        <w:pict w14:anchorId="3EB4B3A9">
-          <v:shapetype id="_x0000_t32" coordsize="21600,21600" o:spt="32" o:oned="t" path="m,l21600,21600e" filled="f">
-            <v:path arrowok="t" fillok="f" o:connecttype="none"/>
-            <o:lock v:ext="edit" shapetype="t"/>
-          </v:shapetype>
-          <v:shape id="Conector recto de flecha 5" o:spid="_x0000_s1044" type="#_x0000_t32" style="position:absolute;left:0;text-align:left;margin-left:203.55pt;margin-top:14.1pt;width:12.75pt;height:12.8pt;rotation:180;flip:x;z-index:29;visibility:visible;mso-wrap-style:square;mso-wrap-distance-left:0;mso-wrap-distance-top:0;mso-wrap-distance-right:0;mso-wrap-distance-bottom:0;mso-position-horizontal:absolute;mso-position-horizontal-relative:text;mso-position-vertical:absolute;mso-position-vertical-relative:text" strokeweight="2pt">
-            <v:stroke joinstyle="miter"/>
-          </v:shape>
-        </w:pict>
-      </w:r>
-      <w:r>
-        <w:rPr>
-          <w:noProof/>
-        </w:rPr>
-        <w:pict w14:anchorId="702A72EE">
-          <v:shape id="Conector recto de flecha 6" o:spid="_x0000_s1043" type="#_x0000_t32" style="position:absolute;left:0;text-align:left;margin-left:292.05pt;margin-top:14.1pt;width:12.75pt;height:12.8pt;rotation:180;flip:x;z-index:30;visibility:visible;mso-wrap-style:square;mso-wrap-distance-left:0;mso-wrap-distance-top:0;mso-wrap-distance-right:0;mso-wrap-distance-bottom:0;mso-position-horizontal:absolute;mso-position-horizontal-relative:text;mso-position-vertical:absolute;mso-position-vertical-relative:text" strokeweight="2pt">
-            <v:stroke joinstyle="miter"/>
-          </v:shape>
-        </w:pict>
-      </w:r>
     </w:p>
     <w:p>
       <w:pPr>
@@ -301,132 +357,21 @@
       </w:pPr>
       <w:r>
         <w:rPr>
-          <w:noProof/>
-        </w:rPr>
-        <w:pict w14:anchorId="700CDD2E">
-          <v:shape id="Conector recto de flecha 3" o:spid="_x0000_s1042" type="#_x0000_t32" style="position:absolute;margin-left:114pt;margin-top:.7pt;width:14.65pt;height:11.1pt;z-index:27;visibility:visible;mso-wrap-style:square;mso-wrap-distance-left:0;mso-wrap-distance-top:0;mso-wrap-distance-right:0;mso-wrap-distance-bottom:0;mso-position-horizontal:absolute;mso-position-horizontal-relative:text;mso-position-vertical:absolute;mso-position-vertical-relative:text" strokeweight="2pt">
-            <v:stroke joinstyle="miter"/>
-          </v:shape>
-        </w:pict>
-      </w:r>
-      <w:r>
-        <w:rPr>
-          <w:noProof/>
-        </w:rPr>
-        <w:pict w14:anchorId="68EF8FB4">
-          <v:shape id="Conector recto de flecha 4" o:spid="_x0000_s1041" type="#_x0000_t32" style="position:absolute;margin-left:113.45pt;margin-top:.4pt;width:12.75pt;height:12.8pt;rotation:180;flip:x;z-index:28;visibility:visible;mso-wrap-style:square;mso-wrap-distance-left:0;mso-wrap-distance-top:0;mso-wrap-distance-right:0;mso-wrap-distance-bottom:0;mso-position-horizontal:absolute;mso-position-horizontal-relative:text;mso-position-vertical:absolute;mso-position-vertical-relative:text" strokeweight="2pt">
-            <v:stroke joinstyle="miter"/>
-          </v:shape>
-        </w:pict>
-      </w:r>
-      <w:r>
-        <w:rPr>
-          <w:noProof/>
-        </w:rPr>
-        <w:pict w14:anchorId="50411149">
-          <v:shape id="Conector recto de flecha 7" o:spid="_x0000_s1040" type="#_x0000_t32" style="position:absolute;margin-left:207.3pt;margin-top:2pt;width:14.65pt;height:11.1pt;z-index:31;visibility:visible;mso-wrap-style:square;mso-wrap-distance-left:0;mso-wrap-distance-top:0;mso-wrap-distance-right:0;mso-wrap-distance-bottom:0;mso-position-horizontal:absolute;mso-position-horizontal-relative:text;mso-position-vertical:absolute;mso-position-vertical-relative:text" strokeweight="2pt">
-            <v:stroke joinstyle="miter"/>
-          </v:shape>
-        </w:pict>
-      </w:r>
-      <w:r>
-        <w:rPr>
-          <w:noProof/>
-        </w:rPr>
-        <w:pict w14:anchorId="19503E43">
-          <v:shape id="Conector recto de flecha 8" o:spid="_x0000_s1039" type="#_x0000_t32" style="position:absolute;margin-left:292.05pt;margin-top:1.05pt;width:14.65pt;height:11.1pt;z-index:32;visibility:visible;mso-wrap-style:square;mso-wrap-distance-left:0;mso-wrap-distance-top:0;mso-wrap-distance-right:0;mso-wrap-distance-bottom:0;mso-position-horizontal:absolute;mso-position-horizontal-relative:text;mso-position-vertical:absolute;mso-position-vertical-relative:text" strokeweight="2pt">
-            <v:stroke joinstyle="miter"/>
-          </v:shape>
-        </w:pict>
-      </w:r>
-      <w:r>
-        <w:rPr>
-          <w:rFonts w:ascii="Arial" w:eastAsia="Arial" w:hAnsi="Arial" w:cs="Arial"/>
-          <w:color w:val="000000"/>
-          <w:sz w:val="24"/>
-          <w:szCs w:val="24"/>
-        </w:rPr>
-        <w:t xml:space="preserve">         </w:t>
-      </w:r>
-      <w:r>
-        <w:rPr>
-          <w:noProof/>
-        </w:rPr>
-        <w:pict w14:anchorId="6E3B5D7F">
-          <v:rect id="Rectángulo 1055" o:spid="_x0000_s1038" style="position:absolute;margin-left:291.3pt;margin-top:.3pt;width:14.65pt;height:12.8pt;z-index:-503316477;visibility:visible;mso-wrap-style:square;mso-wrap-distance-left:0;mso-wrap-distance-top:0;mso-wrap-distance-right:1.85pt;mso-wrap-distance-bottom:2.2pt;mso-position-horizontal:absolute;mso-position-horizontal-relative:text;mso-position-vertical:absolute;mso-position-vertical-relative:text;v-text-anchor:middle" o:gfxdata="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">
-            <v:textbox inset=",1.99mm,,1.99mm">
-              <w:txbxContent>
-                <w:p>
-                  <w:pPr>
-                    <w:pStyle w:val="Contenidodelmarco"/>
-                    <w:spacing w:after="0" w:line="240" w:lineRule="auto"/>
-                    <w:ind w:left="0" w:hanging="2"/>
-                  </w:pPr>
-                </w:p>
-              </w:txbxContent>
-            </v:textbox>
-          </v:rect>
-        </w:pict>
-      </w:r>
-      <w:r>
-        <w:rPr>
-          <w:noProof/>
-        </w:rPr>
-        <w:pict w14:anchorId="48801D35">
-          <v:rect id="Rectángulo 1054" o:spid="_x0000_s1037" style="position:absolute;margin-left:205.05pt;margin-top:.3pt;width:14.65pt;height:12.8pt;z-index:-503316475;visibility:visible;mso-wrap-style:square;mso-wrap-distance-left:0;mso-wrap-distance-top:0;mso-wrap-distance-right:1.85pt;mso-wrap-distance-bottom:2.2pt;mso-position-horizontal:absolute;mso-position-horizontal-relative:text;mso-position-vertical:absolute;mso-position-vertical-relative:text;v-text-anchor:middle" o:gfxdata="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">
-            <v:textbox inset=",1.99mm,,1.99mm">
-              <w:txbxContent>
-                <w:p>
-                  <w:pPr>
-                    <w:pStyle w:val="Contenidodelmarco"/>
-                    <w:spacing w:after="0" w:line="240" w:lineRule="auto"/>
-                    <w:ind w:left="0" w:hanging="2"/>
-                  </w:pPr>
-                </w:p>
-              </w:txbxContent>
-            </v:textbox>
-          </v:rect>
-        </w:pict>
-      </w:r>
-      <w:r>
-        <w:rPr>
-          <w:noProof/>
-        </w:rPr>
-        <w:pict w14:anchorId="36827F6F">
-          <v:rect id="Rectángulo 1051" o:spid="_x0000_s1036" style="position:absolute;margin-left:114.3pt;margin-top:.3pt;width:14.65pt;height:12.8pt;z-index:-503316473;visibility:visible;mso-wrap-style:square;mso-wrap-distance-left:0;mso-wrap-distance-top:0;mso-wrap-distance-right:1.85pt;mso-wrap-distance-bottom:2.2pt;mso-position-horizontal:absolute;mso-position-horizontal-relative:text;mso-position-vertical:absolute;mso-position-vertical-relative:text;v-text-anchor:middle" o:gfxdata="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">
-            <v:textbox inset=",1.99mm,,1.99mm">
-              <w:txbxContent>
-                <w:p>
-                  <w:pPr>
-                    <w:pStyle w:val="Contenidodelmarco"/>
-                    <w:spacing w:after="0" w:line="240" w:lineRule="auto"/>
-                    <w:ind w:left="0" w:hanging="2"/>
-                  </w:pPr>
-                </w:p>
-              </w:txbxContent>
-            </v:textbox>
-          </v:rect>
-        </w:pict>
-      </w:r>
-      <w:r>
-        <w:rPr>
-          <w:noProof/>
-        </w:rPr>
-        <w:pict w14:anchorId="50AB325F">
-          <v:rect id="Rectángulo 1050" o:spid="_x0000_s1035" style="position:absolute;margin-left:12pt;margin-top:.05pt;width:14.65pt;height:12.8pt;z-index:11;visibility:visible;mso-wrap-style:square;mso-wrap-distance-left:0;mso-wrap-distance-top:0;mso-wrap-distance-right:0;mso-wrap-distance-bottom:0;mso-position-horizontal:absolute;mso-position-horizontal-relative:text;mso-position-vertical:absolute;mso-position-vertical-relative:text;v-text-anchor:middle" o:gfxdata="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">
-            <v:textbox inset=",1.99mm,,1.99mm">
-              <w:txbxContent>
-                <w:p>
-                  <w:pPr>
-                    <w:pStyle w:val="Contenidodelmarco"/>
-                    <w:spacing w:after="0" w:line="240" w:lineRule="auto"/>
-                    <w:ind w:left="0" w:hanging="2"/>
-                  </w:pPr>
-                </w:p>
-              </w:txbxContent>
-            </v:textbox>
-          </v:rect>
-        </w:pict>
+          <w:rFonts w:ascii="Arial" w:eastAsia="Arial" w:hAnsi="Arial" w:cs="Arial"/>
+          <w:color w:val="000000"/>
+          <w:sz w:val="24"/>
+          <w:szCs w:val="24"/>
+        </w:rPr>
+        <w:t xml:space="preserve">    </w:t>
+      </w:r>
+      <w:r>
+        <w:rPr>
+          <w:rFonts w:ascii="Arial" w:eastAsia="Arial" w:hAnsi="Arial" w:cs="Arial"/>
+          <w:color w:val="000000"/>
+          <w:sz w:val="24"/>
+          <w:szCs w:val="24"/>
+        </w:rPr>
+        <w:t>{{</w:t>
       </w:r>
       <w:proofErr w:type="spellStart"/>
       <w:r>
@@ -436,7 +381,7 @@
           <w:sz w:val="24"/>
           <w:szCs w:val="24"/>
         </w:rPr>
-        <w:t>Pro-desarrollo</w:t>
+        <w:t>chk_estampilla_pro_desarrollo</w:t>
       </w:r>
       <w:proofErr w:type="spellEnd"/>
       <w:r>
@@ -446,7 +391,16 @@
           <w:sz w:val="24"/>
           <w:szCs w:val="24"/>
         </w:rPr>
-        <w:t xml:space="preserve">        </w:t>
+        <w:t>}}</w:t>
+      </w:r>
+      <w:r>
+        <w:rPr>
+          <w:rFonts w:ascii="Arial" w:eastAsia="Arial" w:hAnsi="Arial" w:cs="Arial"/>
+          <w:color w:val="000000"/>
+          <w:sz w:val="24"/>
+          <w:szCs w:val="24"/>
+        </w:rPr>
+        <w:t xml:space="preserve"> </w:t>
       </w:r>
       <w:proofErr w:type="spellStart"/>
       <w:r>
@@ -456,7 +410,17 @@
           <w:sz w:val="24"/>
           <w:szCs w:val="24"/>
         </w:rPr>
-        <w:t>Pro-hospital</w:t>
+        <w:t>Pro-</w:t>
+      </w:r>
+      <w:proofErr w:type="gramStart"/>
+      <w:r>
+        <w:rPr>
+          <w:rFonts w:ascii="Arial" w:eastAsia="Arial" w:hAnsi="Arial" w:cs="Arial"/>
+          <w:color w:val="000000"/>
+          <w:sz w:val="24"/>
+          <w:szCs w:val="24"/>
+        </w:rPr>
+        <w:t>desarrollo</w:t>
       </w:r>
       <w:proofErr w:type="spellEnd"/>
       <w:r>
@@ -466,7 +430,26 @@
           <w:sz w:val="24"/>
           <w:szCs w:val="24"/>
         </w:rPr>
-        <w:t xml:space="preserve">        </w:t>
+        <w:t xml:space="preserve">  </w:t>
+      </w:r>
+      <w:r>
+        <w:rPr>
+          <w:rFonts w:ascii="Arial" w:eastAsia="Arial" w:hAnsi="Arial" w:cs="Arial"/>
+          <w:color w:val="000000"/>
+          <w:sz w:val="24"/>
+          <w:szCs w:val="24"/>
+        </w:rPr>
+        <w:t>{</w:t>
+      </w:r>
+      <w:proofErr w:type="gramEnd"/>
+      <w:r>
+        <w:rPr>
+          <w:rFonts w:ascii="Arial" w:eastAsia="Arial" w:hAnsi="Arial" w:cs="Arial"/>
+          <w:color w:val="000000"/>
+          <w:sz w:val="24"/>
+          <w:szCs w:val="24"/>
+        </w:rPr>
+        <w:t>{</w:t>
       </w:r>
       <w:proofErr w:type="spellStart"/>
       <w:r>
@@ -476,7 +459,7 @@
           <w:sz w:val="24"/>
           <w:szCs w:val="24"/>
         </w:rPr>
-        <w:t>Pro-cultura</w:t>
+        <w:t>chk_estampilla_pro_hospital</w:t>
       </w:r>
       <w:proofErr w:type="spellEnd"/>
       <w:r>
@@ -486,7 +469,16 @@
           <w:sz w:val="24"/>
           <w:szCs w:val="24"/>
         </w:rPr>
-        <w:t xml:space="preserve">        </w:t>
+        <w:t>}}</w:t>
+      </w:r>
+      <w:r>
+        <w:rPr>
+          <w:rFonts w:ascii="Arial" w:eastAsia="Arial" w:hAnsi="Arial" w:cs="Arial"/>
+          <w:color w:val="000000"/>
+          <w:sz w:val="24"/>
+          <w:szCs w:val="24"/>
+        </w:rPr>
+        <w:t xml:space="preserve"> </w:t>
       </w:r>
       <w:proofErr w:type="spellStart"/>
       <w:r>
@@ -496,6 +488,162 @@
           <w:sz w:val="24"/>
           <w:szCs w:val="24"/>
         </w:rPr>
+        <w:t>Pro-</w:t>
+      </w:r>
+      <w:proofErr w:type="gramStart"/>
+      <w:r>
+        <w:rPr>
+          <w:rFonts w:ascii="Arial" w:eastAsia="Arial" w:hAnsi="Arial" w:cs="Arial"/>
+          <w:color w:val="000000"/>
+          <w:sz w:val="24"/>
+          <w:szCs w:val="24"/>
+        </w:rPr>
+        <w:t>hospital</w:t>
+      </w:r>
+      <w:proofErr w:type="spellEnd"/>
+      <w:r>
+        <w:rPr>
+          <w:rFonts w:ascii="Arial" w:eastAsia="Arial" w:hAnsi="Arial" w:cs="Arial"/>
+          <w:color w:val="000000"/>
+          <w:sz w:val="24"/>
+          <w:szCs w:val="24"/>
+        </w:rPr>
+        <w:t xml:space="preserve">  </w:t>
+      </w:r>
+      <w:r>
+        <w:rPr>
+          <w:rFonts w:ascii="Arial" w:eastAsia="Arial" w:hAnsi="Arial" w:cs="Arial"/>
+          <w:color w:val="000000"/>
+          <w:sz w:val="24"/>
+          <w:szCs w:val="24"/>
+        </w:rPr>
+        <w:t>{</w:t>
+      </w:r>
+      <w:proofErr w:type="gramEnd"/>
+      <w:r>
+        <w:rPr>
+          <w:rFonts w:ascii="Arial" w:eastAsia="Arial" w:hAnsi="Arial" w:cs="Arial"/>
+          <w:color w:val="000000"/>
+          <w:sz w:val="24"/>
+          <w:szCs w:val="24"/>
+        </w:rPr>
+        <w:t>{</w:t>
+      </w:r>
+      <w:proofErr w:type="spellStart"/>
+      <w:r>
+        <w:rPr>
+          <w:rFonts w:ascii="Arial" w:eastAsia="Arial" w:hAnsi="Arial" w:cs="Arial"/>
+          <w:color w:val="000000"/>
+          <w:sz w:val="24"/>
+          <w:szCs w:val="24"/>
+        </w:rPr>
+        <w:t>chk_estampilla_pro_cultura</w:t>
+      </w:r>
+      <w:proofErr w:type="spellEnd"/>
+      <w:r>
+        <w:rPr>
+          <w:rFonts w:ascii="Arial" w:eastAsia="Arial" w:hAnsi="Arial" w:cs="Arial"/>
+          <w:color w:val="000000"/>
+          <w:sz w:val="24"/>
+          <w:szCs w:val="24"/>
+        </w:rPr>
+        <w:t>}}</w:t>
+      </w:r>
+      <w:r>
+        <w:rPr>
+          <w:rFonts w:ascii="Arial" w:eastAsia="Arial" w:hAnsi="Arial" w:cs="Arial"/>
+          <w:color w:val="000000"/>
+          <w:sz w:val="24"/>
+          <w:szCs w:val="24"/>
+        </w:rPr>
+        <w:t xml:space="preserve"> </w:t>
+      </w:r>
+      <w:proofErr w:type="spellStart"/>
+      <w:r>
+        <w:rPr>
+          <w:rFonts w:ascii="Arial" w:eastAsia="Arial" w:hAnsi="Arial" w:cs="Arial"/>
+          <w:color w:val="000000"/>
+          <w:sz w:val="24"/>
+          <w:szCs w:val="24"/>
+        </w:rPr>
+        <w:t>Pro-</w:t>
+      </w:r>
+      <w:proofErr w:type="gramStart"/>
+      <w:r>
+        <w:rPr>
+          <w:rFonts w:ascii="Arial" w:eastAsia="Arial" w:hAnsi="Arial" w:cs="Arial"/>
+          <w:color w:val="000000"/>
+          <w:sz w:val="24"/>
+          <w:szCs w:val="24"/>
+        </w:rPr>
+        <w:t>cultura</w:t>
+      </w:r>
+      <w:proofErr w:type="spellEnd"/>
+      <w:r>
+        <w:rPr>
+          <w:rFonts w:ascii="Arial" w:eastAsia="Arial" w:hAnsi="Arial" w:cs="Arial"/>
+          <w:color w:val="000000"/>
+          <w:sz w:val="24"/>
+          <w:szCs w:val="24"/>
+        </w:rPr>
+        <w:t xml:space="preserve">  </w:t>
+      </w:r>
+      <w:r>
+        <w:rPr>
+          <w:rFonts w:ascii="Arial" w:eastAsia="Arial" w:hAnsi="Arial" w:cs="Arial"/>
+          <w:color w:val="000000"/>
+          <w:sz w:val="24"/>
+          <w:szCs w:val="24"/>
+        </w:rPr>
+        <w:t>{</w:t>
+      </w:r>
+      <w:proofErr w:type="gramEnd"/>
+      <w:r>
+        <w:rPr>
+          <w:rFonts w:ascii="Arial" w:eastAsia="Arial" w:hAnsi="Arial" w:cs="Arial"/>
+          <w:color w:val="000000"/>
+          <w:sz w:val="24"/>
+          <w:szCs w:val="24"/>
+        </w:rPr>
+        <w:t>{</w:t>
+      </w:r>
+      <w:proofErr w:type="spellStart"/>
+      <w:r>
+        <w:rPr>
+          <w:rFonts w:ascii="Arial" w:eastAsia="Arial" w:hAnsi="Arial" w:cs="Arial"/>
+          <w:color w:val="000000"/>
+          <w:sz w:val="24"/>
+          <w:szCs w:val="24"/>
+        </w:rPr>
+        <w:t>chk_estampilla_pro_bienestar</w:t>
+      </w:r>
+      <w:proofErr w:type="spellEnd"/>
+      <w:r>
+        <w:rPr>
+          <w:rFonts w:ascii="Arial" w:eastAsia="Arial" w:hAnsi="Arial" w:cs="Arial"/>
+          <w:color w:val="000000"/>
+          <w:sz w:val="24"/>
+          <w:szCs w:val="24"/>
+        </w:rPr>
+        <w:t>}}</w:t>
+      </w:r>
+      <w:r>
+        <w:rPr>
+          <w:rFonts w:ascii="Arial" w:eastAsia="Arial" w:hAnsi="Arial" w:cs="Arial"/>
+          <w:color w:val="000000"/>
+          <w:sz w:val="24"/>
+          <w:szCs w:val="24"/>
+        </w:rPr>
+        <w:t xml:space="preserve"> </w:t>
+      </w:r>
+      <w:proofErr w:type="spellStart"/>
+      <w:r>
+        <w:rPr>
+          <w:rFonts w:ascii="Arial" w:eastAsia="Arial" w:hAnsi="Arial" w:cs="Arial"/>
+          <w:color w:val="000000"/>
+          <w:sz w:val="24"/>
+          <w:szCs w:val="24"/>
+        </w:rPr>
         <w:t>Pro-bienestar</w:t>
       </w:r>
       <w:proofErr w:type="spellEnd"/>
@@ -580,81 +728,117 @@
       </w:pPr>
       <w:r>
         <w:rPr>
-          <w:noProof/>
-        </w:rPr>
-        <w:pict w14:anchorId="649E4331">
-          <v:shape id="Conector recto de flecha 1" o:spid="_x0000_s1034" type="#_x0000_t32" style="position:absolute;left:0;text-align:left;margin-left:2.6pt;margin-top:.25pt;width:14.65pt;height:11.1pt;z-index:25;visibility:visible;mso-wrap-style:square;mso-wrap-distance-left:0;mso-wrap-distance-top:0;mso-wrap-distance-right:0;mso-wrap-distance-bottom:0;mso-position-horizontal:absolute;mso-position-horizontal-relative:text;mso-position-vertical:absolute;mso-position-vertical-relative:text" strokeweight="2pt">
-            <v:stroke joinstyle="miter"/>
-          </v:shape>
-        </w:pict>
-      </w:r>
-      <w:r>
-        <w:rPr>
-          <w:rFonts w:ascii="Arial" w:eastAsia="Arial" w:hAnsi="Arial" w:cs="Arial"/>
-          <w:color w:val="000000"/>
-          <w:sz w:val="24"/>
-          <w:szCs w:val="24"/>
-        </w:rPr>
-        <w:t xml:space="preserve">     </w:t>
-      </w:r>
-      <w:r>
-        <w:rPr>
-          <w:noProof/>
-        </w:rPr>
-        <w:pict w14:anchorId="23453F8F">
-          <v:rect id="Rectángulo 1059" o:spid="_x0000_s1033" style="position:absolute;left:0;text-align:left;margin-left:261.3pt;margin-top:.3pt;width:14.65pt;height:12.8pt;z-index:-503316471;visibility:visible;mso-wrap-style:square;mso-wrap-distance-left:0;mso-wrap-distance-top:0;mso-wrap-distance-right:1.85pt;mso-wrap-distance-bottom:2.2pt;mso-position-horizontal:absolute;mso-position-horizontal-relative:text;mso-position-vertical:absolute;mso-position-vertical-relative:text;v-text-anchor:middle" o:gfxdata="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">
-            <v:textbox inset=",1.99mm,,1.99mm">
-              <w:txbxContent>
-                <w:p>
-                  <w:pPr>
-                    <w:pStyle w:val="Contenidodelmarco"/>
-                    <w:spacing w:after="0" w:line="240" w:lineRule="auto"/>
-                    <w:ind w:left="0" w:hanging="2"/>
-                  </w:pPr>
-                </w:p>
-              </w:txbxContent>
-            </v:textbox>
-          </v:rect>
-        </w:pict>
-      </w:r>
-      <w:r>
-        <w:rPr>
-          <w:noProof/>
-        </w:rPr>
-        <w:pict w14:anchorId="1290377D">
-          <v:rect id="Rectángulo 1060" o:spid="_x0000_s1032" style="position:absolute;left:0;text-align:left;margin-left:2pt;margin-top:.05pt;width:14.65pt;height:12.8pt;z-index:13;visibility:visible;mso-wrap-style:square;mso-wrap-distance-left:0;mso-wrap-distance-top:0;mso-wrap-distance-right:0;mso-wrap-distance-bottom:0;mso-position-horizontal:absolute;mso-position-horizontal-relative:text;mso-position-vertical:absolute;mso-position-vertical-relative:text;v-text-anchor:middle" o:gfxdata="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">
-            <v:textbox inset=",1.99mm,,1.99mm">
-              <w:txbxContent>
-                <w:p>
-                  <w:pPr>
-                    <w:pStyle w:val="Contenidodelmarco"/>
-                    <w:spacing w:after="0" w:line="240" w:lineRule="auto"/>
-                    <w:ind w:left="0" w:hanging="2"/>
-                  </w:pPr>
-                </w:p>
-              </w:txbxContent>
-            </v:textbox>
-          </v:rect>
-        </w:pict>
-      </w:r>
-      <w:r>
-        <w:rPr>
-          <w:noProof/>
-        </w:rPr>
-        <w:pict w14:anchorId="548AF5BE">
-          <v:shape id="Conector recto de flecha 2" o:spid="_x0000_s1031" type="#_x0000_t32" style="position:absolute;left:0;text-align:left;margin-left:.5pt;margin-top:-1.5pt;width:12.75pt;height:12.8pt;rotation:180;flip:x;z-index:26;visibility:visible;mso-wrap-style:square;mso-wrap-distance-left:0;mso-wrap-distance-top:0;mso-wrap-distance-right:0;mso-wrap-distance-bottom:0;mso-position-horizontal:absolute;mso-position-horizontal-relative:text;mso-position-vertical:absolute;mso-position-vertical-relative:text" strokeweight="2pt">
-            <v:stroke joinstyle="miter"/>
-          </v:shape>
-        </w:pict>
-      </w:r>
-      <w:r>
-        <w:rPr>
-          <w:rFonts w:ascii="Arial" w:eastAsia="Arial" w:hAnsi="Arial" w:cs="Arial"/>
-          <w:color w:val="000000"/>
-          <w:sz w:val="24"/>
-          <w:szCs w:val="24"/>
-        </w:rPr>
-        <w:t xml:space="preserve">Prestación de Servicios Apoyo a la Gestión          Prestación de Servicios Profesionales </w:t>
+          <w:rFonts w:ascii="Arial" w:eastAsia="Arial" w:hAnsi="Arial" w:cs="Arial"/>
+          <w:color w:val="000000"/>
+          <w:sz w:val="24"/>
+          <w:szCs w:val="24"/>
+        </w:rPr>
+        <w:t>{{</w:t>
+      </w:r>
+      <w:proofErr w:type="spellStart"/>
+      <w:r>
+        <w:rPr>
+          <w:rFonts w:ascii="Arial" w:eastAsia="Arial" w:hAnsi="Arial" w:cs="Arial"/>
+          <w:color w:val="000000"/>
+          <w:sz w:val="24"/>
+          <w:szCs w:val="24"/>
+        </w:rPr>
+        <w:t>chk_contrato_apoyo_gestion</w:t>
+      </w:r>
+      <w:proofErr w:type="spellEnd"/>
+      <w:r>
+        <w:rPr>
+          <w:rFonts w:ascii="Arial" w:eastAsia="Arial" w:hAnsi="Arial" w:cs="Arial"/>
+          <w:color w:val="000000"/>
+          <w:sz w:val="24"/>
+          <w:szCs w:val="24"/>
+        </w:rPr>
+        <w:t>}}</w:t>
+      </w:r>
+      <w:r>
+        <w:rPr>
+          <w:rFonts w:ascii="Arial" w:eastAsia="Arial" w:hAnsi="Arial" w:cs="Arial"/>
+          <w:color w:val="000000"/>
+          <w:sz w:val="24"/>
+          <w:szCs w:val="24"/>
+        </w:rPr>
+        <w:t xml:space="preserve"> </w:t>
+      </w:r>
+      <w:r>
+        <w:rPr>
+          <w:rFonts w:ascii="Arial" w:eastAsia="Arial" w:hAnsi="Arial" w:cs="Arial"/>
+          <w:color w:val="000000"/>
+          <w:sz w:val="24"/>
+          <w:szCs w:val="24"/>
+        </w:rPr>
+        <w:t xml:space="preserve">Prestación de Servicios Apoyo a la Gestión   </w:t>
+      </w:r>
+      <w:proofErr w:type="gramStart"/>
+      <w:r>
+        <w:rPr>
+          <w:rFonts w:ascii="Arial" w:eastAsia="Arial" w:hAnsi="Arial" w:cs="Arial"/>
+          <w:color w:val="000000"/>
+          <w:sz w:val="24"/>
+          <w:szCs w:val="24"/>
+        </w:rPr>
+        <w:t xml:space="preserve">   </w:t>
+      </w:r>
+      <w:r>
+        <w:rPr>
+          <w:rFonts w:ascii="Arial" w:eastAsia="Arial" w:hAnsi="Arial" w:cs="Arial"/>
+          <w:color w:val="000000"/>
+          <w:sz w:val="24"/>
+          <w:szCs w:val="24"/>
+        </w:rPr>
+        <w:t>{</w:t>
+      </w:r>
+      <w:proofErr w:type="gramEnd"/>
+      <w:r>
+        <w:rPr>
+          <w:rFonts w:ascii="Arial" w:eastAsia="Arial" w:hAnsi="Arial" w:cs="Arial"/>
+          <w:color w:val="000000"/>
+          <w:sz w:val="24"/>
+          <w:szCs w:val="24"/>
+        </w:rPr>
+        <w:t>{</w:t>
+      </w:r>
+      <w:proofErr w:type="spellStart"/>
+      <w:r>
+        <w:rPr>
+          <w:rFonts w:ascii="Arial" w:eastAsia="Arial" w:hAnsi="Arial" w:cs="Arial"/>
+          <w:color w:val="000000"/>
+          <w:sz w:val="24"/>
+          <w:szCs w:val="24"/>
+        </w:rPr>
+        <w:t>chk_contrato_prof_servicios</w:t>
+      </w:r>
+      <w:proofErr w:type="spellEnd"/>
+      <w:r>
+        <w:rPr>
+          <w:rFonts w:ascii="Arial" w:eastAsia="Arial" w:hAnsi="Arial" w:cs="Arial"/>
+          <w:color w:val="000000"/>
+          <w:sz w:val="24"/>
+          <w:szCs w:val="24"/>
+        </w:rPr>
+        <w:t>}}</w:t>
+      </w:r>
+      <w:r>
+        <w:rPr>
+          <w:rFonts w:ascii="Arial" w:eastAsia="Arial" w:hAnsi="Arial" w:cs="Arial"/>
+          <w:color w:val="000000"/>
+          <w:sz w:val="24"/>
+          <w:szCs w:val="24"/>
+        </w:rPr>
+        <w:t xml:space="preserve"> </w:t>
+      </w:r>
+      <w:r>
+        <w:rPr>
+          <w:rFonts w:ascii="Arial" w:eastAsia="Arial" w:hAnsi="Arial" w:cs="Arial"/>
+          <w:color w:val="000000"/>
+          <w:sz w:val="24"/>
+          <w:szCs w:val="24"/>
+        </w:rPr>
+        <w:t xml:space="preserve">Prestación de Servicios Profesionales </w:t>
       </w:r>
     </w:p>
     <w:p>
@@ -689,56 +873,103 @@
           <w:sz w:val="24"/>
           <w:szCs w:val="24"/>
         </w:rPr>
-        <w:t xml:space="preserve">     </w:t>
-      </w:r>
-      <w:r>
-        <w:rPr>
-          <w:noProof/>
-        </w:rPr>
-        <w:pict w14:anchorId="29863DAF">
-          <v:rect id="Rectángulo 1062" o:spid="_x0000_s1030" style="position:absolute;left:0;text-align:left;margin-left:261pt;margin-top:.05pt;width:14.65pt;height:12.8pt;z-index:15;visibility:visible;mso-wrap-style:square;mso-wrap-distance-left:0;mso-wrap-distance-top:0;mso-wrap-distance-right:0;mso-wrap-distance-bottom:0;mso-position-horizontal:absolute;mso-position-horizontal-relative:text;mso-position-vertical:absolute;mso-position-vertical-relative:text;v-text-anchor:middle" o:gfxdata="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">
-            <v:textbox inset=",1.99mm,,1.99mm">
-              <w:txbxContent>
-                <w:p>
-                  <w:pPr>
-                    <w:pStyle w:val="Contenidodelmarco"/>
-                    <w:spacing w:after="0" w:line="240" w:lineRule="auto"/>
-                    <w:ind w:left="0" w:hanging="2"/>
-                  </w:pPr>
-                </w:p>
-              </w:txbxContent>
-            </v:textbox>
-          </v:rect>
-        </w:pict>
-      </w:r>
-      <w:r>
-        <w:rPr>
-          <w:noProof/>
-        </w:rPr>
-        <w:pict w14:anchorId="37D6AA25">
-          <v:rect id="Rectángulo 1046" o:spid="_x0000_s1029" style="position:absolute;left:0;text-align:left;margin-left:2pt;margin-top:.05pt;width:14.65pt;height:12.8pt;z-index:17;visibility:visible;mso-wrap-style:square;mso-wrap-distance-left:0;mso-wrap-distance-top:0;mso-wrap-distance-right:0;mso-wrap-distance-bottom:0;mso-position-horizontal:absolute;mso-position-horizontal-relative:text;mso-position-vertical:absolute;mso-position-vertical-relative:text;v-text-anchor:middle" o:gfxdata="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">
-            <v:textbox inset=",1.99mm,,1.99mm">
-              <w:txbxContent>
-                <w:p>
-                  <w:pPr>
-                    <w:pStyle w:val="Contenidodelmarco"/>
-                    <w:spacing w:after="0" w:line="240" w:lineRule="auto"/>
-                    <w:ind w:left="0" w:hanging="2"/>
-                  </w:pPr>
-                </w:p>
-              </w:txbxContent>
-            </v:textbox>
-          </v:rect>
-        </w:pict>
-      </w:r>
-      <w:r>
-        <w:rPr>
-          <w:rFonts w:ascii="Arial" w:eastAsia="Arial" w:hAnsi="Arial" w:cs="Arial"/>
-          <w:color w:val="000000"/>
-          <w:sz w:val="24"/>
-          <w:szCs w:val="24"/>
-        </w:rPr>
-        <w:t xml:space="preserve">Contratos de Obra                                                 Contratos de Consultoría </w:t>
+        <w:t>{{</w:t>
+      </w:r>
+      <w:proofErr w:type="spellStart"/>
+      <w:r>
+        <w:rPr>
+          <w:rFonts w:ascii="Arial" w:eastAsia="Arial" w:hAnsi="Arial" w:cs="Arial"/>
+          <w:color w:val="000000"/>
+          <w:sz w:val="24"/>
+          <w:szCs w:val="24"/>
+        </w:rPr>
+        <w:t>chk_contrato_obra</w:t>
+      </w:r>
+      <w:proofErr w:type="spellEnd"/>
+      <w:r>
+        <w:rPr>
+          <w:rFonts w:ascii="Arial" w:eastAsia="Arial" w:hAnsi="Arial" w:cs="Arial"/>
+          <w:color w:val="000000"/>
+          <w:sz w:val="24"/>
+          <w:szCs w:val="24"/>
+        </w:rPr>
+        <w:t>}}</w:t>
+      </w:r>
+      <w:r>
+        <w:rPr>
+          <w:rFonts w:ascii="Arial" w:eastAsia="Arial" w:hAnsi="Arial" w:cs="Arial"/>
+          <w:color w:val="000000"/>
+          <w:sz w:val="24"/>
+          <w:szCs w:val="24"/>
+        </w:rPr>
+        <w:t xml:space="preserve"> </w:t>
+      </w:r>
+      <w:r>
+        <w:rPr>
+          <w:rFonts w:ascii="Arial" w:eastAsia="Arial" w:hAnsi="Arial" w:cs="Arial"/>
+          <w:color w:val="000000"/>
+          <w:sz w:val="24"/>
+          <w:szCs w:val="24"/>
+        </w:rPr>
+        <w:t xml:space="preserve">Contratos de Obra                                             </w:t>
+      </w:r>
+      <w:proofErr w:type="gramStart"/>
+      <w:r>
+        <w:rPr>
+          <w:rFonts w:ascii="Arial" w:eastAsia="Arial" w:hAnsi="Arial" w:cs="Arial"/>
+          <w:color w:val="000000"/>
+          <w:sz w:val="24"/>
+          <w:szCs w:val="24"/>
+        </w:rPr>
+        <w:t xml:space="preserve">   </w:t>
+      </w:r>
+      <w:r>
+        <w:rPr>
+          <w:rFonts w:ascii="Arial" w:eastAsia="Arial" w:hAnsi="Arial" w:cs="Arial"/>
+          <w:color w:val="000000"/>
+          <w:sz w:val="24"/>
+          <w:szCs w:val="24"/>
+        </w:rPr>
+        <w:t>{</w:t>
+      </w:r>
+      <w:proofErr w:type="gramEnd"/>
+      <w:r>
+        <w:rPr>
+          <w:rFonts w:ascii="Arial" w:eastAsia="Arial" w:hAnsi="Arial" w:cs="Arial"/>
+          <w:color w:val="000000"/>
+          <w:sz w:val="24"/>
+          <w:szCs w:val="24"/>
+        </w:rPr>
+        <w:t>{</w:t>
+      </w:r>
+      <w:proofErr w:type="spellStart"/>
+      <w:r>
+        <w:rPr>
+          <w:rFonts w:ascii="Arial" w:eastAsia="Arial" w:hAnsi="Arial" w:cs="Arial"/>
+          <w:color w:val="000000"/>
+          <w:sz w:val="24"/>
+          <w:szCs w:val="24"/>
+        </w:rPr>
+        <w:t>chk_contrato_consultoria</w:t>
+      </w:r>
+      <w:proofErr w:type="spellEnd"/>
+      <w:r>
+        <w:rPr>
+          <w:rFonts w:ascii="Arial" w:eastAsia="Arial" w:hAnsi="Arial" w:cs="Arial"/>
+          <w:color w:val="000000"/>
+          <w:sz w:val="24"/>
+          <w:szCs w:val="24"/>
+        </w:rPr>
+        <w:t>}}</w:t>
+      </w:r>
+      <w:r>
+        <w:rPr>
+          <w:rFonts w:ascii="Arial" w:eastAsia="Arial" w:hAnsi="Arial" w:cs="Arial"/>
+          <w:color w:val="000000"/>
+          <w:sz w:val="24"/>
+          <w:szCs w:val="24"/>
+        </w:rPr>
+        <w:t xml:space="preserve"> Contratos de Consultoría </w:t>
       </w:r>
     </w:p>
     <w:p>
@@ -773,56 +1004,94 @@
           <w:sz w:val="24"/>
           <w:szCs w:val="24"/>
         </w:rPr>
-        <w:t xml:space="preserve">     </w:t>
-      </w:r>
-      <w:r>
-        <w:rPr>
-          <w:noProof/>
-        </w:rPr>
-        <w:pict w14:anchorId="707F6355">
-          <v:rect id="Rectángulo 1047" o:spid="_x0000_s1028" style="position:absolute;left:0;text-align:left;margin-left:3pt;margin-top:.05pt;width:14.65pt;height:12.8pt;z-index:19;visibility:visible;mso-wrap-style:square;mso-wrap-distance-left:0;mso-wrap-distance-top:0;mso-wrap-distance-right:0;mso-wrap-distance-bottom:0;mso-position-horizontal:absolute;mso-position-horizontal-relative:text;mso-position-vertical:absolute;mso-position-vertical-relative:text;v-text-anchor:middle" o:gfxdata="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">
-            <v:textbox inset=",1.99mm,,1.99mm">
-              <w:txbxContent>
-                <w:p>
-                  <w:pPr>
-                    <w:pStyle w:val="Contenidodelmarco"/>
-                    <w:spacing w:after="0" w:line="240" w:lineRule="auto"/>
-                    <w:ind w:left="0" w:hanging="2"/>
-                  </w:pPr>
-                </w:p>
-              </w:txbxContent>
-            </v:textbox>
-          </v:rect>
-        </w:pict>
-      </w:r>
-      <w:r>
-        <w:rPr>
-          <w:noProof/>
-        </w:rPr>
-        <w:pict w14:anchorId="53175544">
-          <v:rect id="Rectángulo 1048" o:spid="_x0000_s1027" style="position:absolute;left:0;text-align:left;margin-left:261pt;margin-top:.05pt;width:14.65pt;height:12.8pt;z-index:21;visibility:visible;mso-wrap-style:square;mso-wrap-distance-left:0;mso-wrap-distance-top:0;mso-wrap-distance-right:0;mso-wrap-distance-bottom:0;mso-position-horizontal:absolute;mso-position-horizontal-relative:text;mso-position-vertical:absolute;mso-position-vertical-relative:text;v-text-anchor:middle" o:gfxdata="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">
-            <v:textbox inset=",1.99mm,,1.99mm">
-              <w:txbxContent>
-                <w:p>
-                  <w:pPr>
-                    <w:pStyle w:val="Contenidodelmarco"/>
-                    <w:spacing w:after="0" w:line="240" w:lineRule="auto"/>
-                    <w:ind w:left="0" w:hanging="2"/>
-                  </w:pPr>
-                </w:p>
-              </w:txbxContent>
-            </v:textbox>
-          </v:rect>
-        </w:pict>
-      </w:r>
-      <w:r>
-        <w:rPr>
-          <w:rFonts w:ascii="Arial" w:eastAsia="Arial" w:hAnsi="Arial" w:cs="Arial"/>
-          <w:color w:val="000000"/>
-          <w:sz w:val="24"/>
-          <w:szCs w:val="24"/>
-        </w:rPr>
-        <w:t xml:space="preserve">Compra Venta y/o Suministros                              Proveedor </w:t>
+        <w:t>{{</w:t>
+      </w:r>
+      <w:proofErr w:type="spellStart"/>
+      <w:r>
+        <w:rPr>
+          <w:rFonts w:ascii="Arial" w:eastAsia="Arial" w:hAnsi="Arial" w:cs="Arial"/>
+          <w:color w:val="000000"/>
+          <w:sz w:val="24"/>
+          <w:szCs w:val="24"/>
+        </w:rPr>
+        <w:t>chk_contrato_compraventa</w:t>
+      </w:r>
+      <w:proofErr w:type="spellEnd"/>
+      <w:r>
+        <w:rPr>
+          <w:rFonts w:ascii="Arial" w:eastAsia="Arial" w:hAnsi="Arial" w:cs="Arial"/>
+          <w:color w:val="000000"/>
+          <w:sz w:val="24"/>
+          <w:szCs w:val="24"/>
+        </w:rPr>
+        <w:t>}}</w:t>
+      </w:r>
+      <w:r>
+        <w:rPr>
+          <w:rFonts w:ascii="Arial" w:eastAsia="Arial" w:hAnsi="Arial" w:cs="Arial"/>
+          <w:color w:val="000000"/>
+          <w:sz w:val="24"/>
+          <w:szCs w:val="24"/>
+        </w:rPr>
+        <w:t xml:space="preserve"> Compra Venta y/o Suministros                          </w:t>
+      </w:r>
+      <w:proofErr w:type="gramStart"/>
+      <w:r>
+        <w:rPr>
+          <w:rFonts w:ascii="Arial" w:eastAsia="Arial" w:hAnsi="Arial" w:cs="Arial"/>
+          <w:color w:val="000000"/>
+          <w:sz w:val="24"/>
+          <w:szCs w:val="24"/>
+        </w:rPr>
+        <w:t xml:space="preserve">   </w:t>
+      </w:r>
+      <w:r>
+        <w:rPr>
+          <w:rFonts w:ascii="Arial" w:eastAsia="Arial" w:hAnsi="Arial" w:cs="Arial"/>
+          <w:color w:val="000000"/>
+          <w:sz w:val="24"/>
+          <w:szCs w:val="24"/>
+        </w:rPr>
+        <w:t>{</w:t>
+      </w:r>
+      <w:proofErr w:type="gramEnd"/>
+      <w:r>
+        <w:rPr>
+          <w:rFonts w:ascii="Arial" w:eastAsia="Arial" w:hAnsi="Arial" w:cs="Arial"/>
+          <w:color w:val="000000"/>
+          <w:sz w:val="24"/>
+          <w:szCs w:val="24"/>
+        </w:rPr>
+        <w:t>{</w:t>
+      </w:r>
+      <w:proofErr w:type="spellStart"/>
+      <w:r>
+        <w:rPr>
+          <w:rFonts w:ascii="Arial" w:eastAsia="Arial" w:hAnsi="Arial" w:cs="Arial"/>
+          <w:color w:val="000000"/>
+          <w:sz w:val="24"/>
+          <w:szCs w:val="24"/>
+        </w:rPr>
+        <w:t>chk_contrato_proveedor</w:t>
+      </w:r>
+      <w:proofErr w:type="spellEnd"/>
+      <w:r>
+        <w:rPr>
+          <w:rFonts w:ascii="Arial" w:eastAsia="Arial" w:hAnsi="Arial" w:cs="Arial"/>
+          <w:color w:val="000000"/>
+          <w:sz w:val="24"/>
+          <w:szCs w:val="24"/>
+        </w:rPr>
+        <w:t>}}</w:t>
+      </w:r>
+      <w:r>
+        <w:rPr>
+          <w:rFonts w:ascii="Arial" w:eastAsia="Arial" w:hAnsi="Arial" w:cs="Arial"/>
+          <w:color w:val="000000"/>
+          <w:sz w:val="24"/>
+          <w:szCs w:val="24"/>
+        </w:rPr>
+        <w:t xml:space="preserve"> Proveedor </w:t>
       </w:r>
     </w:p>
     <w:p>
@@ -857,36 +1126,45 @@
           <w:sz w:val="24"/>
           <w:szCs w:val="24"/>
         </w:rPr>
-        <w:t xml:space="preserve">     </w:t>
-      </w:r>
-      <w:r>
-        <w:rPr>
-          <w:noProof/>
-        </w:rPr>
-        <w:pict w14:anchorId="0CF99A08">
-          <v:rect id="Rectángulo 1049" o:spid="_x0000_s1026" style="position:absolute;left:0;text-align:left;margin-left:2pt;margin-top:.05pt;width:14.65pt;height:12.8pt;z-index:23;visibility:visible;mso-wrap-style:square;mso-wrap-distance-left:0;mso-wrap-distance-top:0;mso-wrap-distance-right:0;mso-wrap-distance-bottom:0;mso-position-horizontal:absolute;mso-position-horizontal-relative:text;mso-position-vertical:absolute;mso-position-vertical-relative:text;v-text-anchor:middle" o:gfxdata="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">
-            <v:textbox inset=",1.99mm,,1.99mm">
-              <w:txbxContent>
-                <w:p>
-                  <w:pPr>
-                    <w:pStyle w:val="Contenidodelmarco"/>
-                    <w:spacing w:after="0" w:line="240" w:lineRule="auto"/>
-                    <w:ind w:left="0" w:hanging="2"/>
-                  </w:pPr>
-                </w:p>
-              </w:txbxContent>
-            </v:textbox>
-          </v:rect>
-        </w:pict>
-      </w:r>
-      <w:r>
-        <w:rPr>
-          <w:rFonts w:ascii="Arial" w:eastAsia="Arial" w:hAnsi="Arial" w:cs="Arial"/>
-          <w:color w:val="000000"/>
-          <w:sz w:val="24"/>
-          <w:szCs w:val="24"/>
-        </w:rPr>
-        <w:t>Otro</w:t>
+        <w:t xml:space="preserve"> </w:t>
+      </w:r>
+      <w:r>
+        <w:rPr>
+          <w:rFonts w:ascii="Arial" w:eastAsia="Arial" w:hAnsi="Arial" w:cs="Arial"/>
+          <w:color w:val="000000"/>
+          <w:sz w:val="24"/>
+          <w:szCs w:val="24"/>
+        </w:rPr>
+        <w:t>{{</w:t>
+      </w:r>
+      <w:proofErr w:type="spellStart"/>
+      <w:r>
+        <w:rPr>
+          <w:rFonts w:ascii="Arial" w:eastAsia="Arial" w:hAnsi="Arial" w:cs="Arial"/>
+          <w:color w:val="000000"/>
+          <w:sz w:val="24"/>
+          <w:szCs w:val="24"/>
+        </w:rPr>
+        <w:t>chk_contrato_otro</w:t>
+      </w:r>
+      <w:proofErr w:type="spellEnd"/>
+      <w:r>
+        <w:rPr>
+          <w:rFonts w:ascii="Arial" w:eastAsia="Arial" w:hAnsi="Arial" w:cs="Arial"/>
+          <w:color w:val="000000"/>
+          <w:sz w:val="24"/>
+          <w:szCs w:val="24"/>
+        </w:rPr>
+        <w:t>}}</w:t>
+      </w:r>
+      <w:r>
+        <w:rPr>
+          <w:rFonts w:ascii="Arial" w:eastAsia="Arial" w:hAnsi="Arial" w:cs="Arial"/>
+          <w:color w:val="000000"/>
+          <w:sz w:val="24"/>
+          <w:szCs w:val="24"/>
+        </w:rPr>
+        <w:t xml:space="preserve"> Otro</w:t>
       </w:r>
     </w:p>
     <w:p>
@@ -916,7 +1194,23 @@
           <w:rFonts w:ascii="Arial" w:hAnsi="Arial"/>
           <w:sz w:val="24"/>
         </w:rPr>
-        <w:t>Especificar cual: {{especificar_contrato_estampillas}}</w:t>
+        <w:t>Especificar cual: {{</w:t>
+      </w:r>
+      <w:proofErr w:type="spellStart"/>
+      <w:r>
+        <w:rPr>
+          <w:rFonts w:ascii="Arial" w:hAnsi="Arial"/>
+          <w:sz w:val="24"/>
+        </w:rPr>
+        <w:t>especificar_contrato_estampillas</w:t>
+      </w:r>
+      <w:proofErr w:type="spellEnd"/>
+      <w:r>
+        <w:rPr>
+          <w:rFonts w:ascii="Arial" w:hAnsi="Arial"/>
+          <w:sz w:val="24"/>
+        </w:rPr>
+        <w:t>}}</w:t>
       </w:r>
     </w:p>
     <w:p>
@@ -1045,20 +1339,70 @@
           <w:b/>
           <w:sz w:val="24"/>
         </w:rPr>
-        <w:t>{{nombre_contratista}}</w:t>
-      </w:r>
-    </w:p>
-    <w:p>
-      <w:pPr>
-        <w:spacing w:after="0" w:line="240" w:lineRule="auto"/>
-        <w:ind w:left="0" w:hanging="2"/>
-      </w:pPr>
+        <w:t>{{</w:t>
+      </w:r>
+      <w:proofErr w:type="spellStart"/>
       <w:r>
         <w:rPr>
           <w:rFonts w:ascii="Arial" w:hAnsi="Arial"/>
-          <w:sz w:val="24"/>
-        </w:rPr>
-        <w:t>C.C {{identificacion_contratista}} Expedida en {{lugar_expedicion_cc}}</w:t>
+          <w:b/>
+          <w:sz w:val="24"/>
+        </w:rPr>
+        <w:t>nombre_contratista</w:t>
+      </w:r>
+      <w:proofErr w:type="spellEnd"/>
+      <w:r>
+        <w:rPr>
+          <w:rFonts w:ascii="Arial" w:hAnsi="Arial"/>
+          <w:b/>
+          <w:sz w:val="24"/>
+        </w:rPr>
+        <w:t>}}</w:t>
+      </w:r>
+    </w:p>
+    <w:p>
+      <w:pPr>
+        <w:spacing w:after="0" w:line="240" w:lineRule="auto"/>
+        <w:ind w:left="0" w:hanging="2"/>
+      </w:pPr>
+      <w:r>
+        <w:rPr>
+          <w:rFonts w:ascii="Arial" w:hAnsi="Arial"/>
+          <w:sz w:val="24"/>
+        </w:rPr>
+        <w:t>C.C {{</w:t>
+      </w:r>
+      <w:proofErr w:type="spellStart"/>
+      <w:r>
+        <w:rPr>
+          <w:rFonts w:ascii="Arial" w:hAnsi="Arial"/>
+          <w:sz w:val="24"/>
+        </w:rPr>
+        <w:t>identificacion_contratista</w:t>
+      </w:r>
+      <w:proofErr w:type="spellEnd"/>
+      <w:r>
+        <w:rPr>
+          <w:rFonts w:ascii="Arial" w:hAnsi="Arial"/>
+          <w:sz w:val="24"/>
+        </w:rPr>
+        <w:t>}} Expedida en {{</w:t>
+      </w:r>
+      <w:proofErr w:type="spellStart"/>
+      <w:r>
+        <w:rPr>
+          <w:rFonts w:ascii="Arial" w:hAnsi="Arial"/>
+          <w:sz w:val="24"/>
+        </w:rPr>
+        <w:t>lugar_expedicion_cc</w:t>
+      </w:r>
+      <w:proofErr w:type="spellEnd"/>
+      <w:r>
+        <w:rPr>
+          <w:rFonts w:ascii="Arial" w:hAnsi="Arial"/>
+          <w:sz w:val="24"/>
+        </w:rPr>
+        <w:t>}}</w:t>
       </w:r>
     </w:p>
     <w:sectPr>

</xml_diff>